<commit_message>
Ajusta tabela de big numbers e roteiro de vídeo para tom de sugestão, não ordem
Co-Authored-By: Claude Sonnet 5 <noreply@anthropic.com>
Claude-Session: https://claude.ai/code/session_01GQSqEjEuqv44iBdACeUWUZ
</commit_message>
<xml_diff>
--- a/eleva/analise-campanha-carteiras-cinco-dias-squeeze-page.docx
+++ b/eleva/analise-campanha-carteiras-cinco-dias-squeeze-page.docx
@@ -522,76 +522,6 @@
                 <w:szCs w:val="19"/>
               </w:rPr>
               <w:t xml:space="preserve">R$15,18</w:t>
-            </w:r>
-          </w:p>
-        </w:tc>
-      </w:tr>
-      <w:tr>
-        <w:tc>
-          <w:tcPr>
-            <w:tcW w:type="dxa" w:w="2256"/>
-          </w:tcPr>
-          <w:p>
-            <w:r>
-              <w:rPr>
-                <w:b w:val="false"/>
-                <w:bCs w:val="false"/>
-                <w:color w:val="000000"/>
-                <w:sz w:val="19"/>
-                <w:szCs w:val="19"/>
-              </w:rPr>
-              <w:t xml:space="preserve">Orçamento</w:t>
-            </w:r>
-          </w:p>
-        </w:tc>
-        <w:tc>
-          <w:tcPr>
-            <w:tcW w:type="dxa" w:w="2256"/>
-          </w:tcPr>
-          <w:p>
-            <w:r>
-              <w:rPr>
-                <w:b w:val="false"/>
-                <w:bCs w:val="false"/>
-                <w:color w:val="000000"/>
-                <w:sz w:val="19"/>
-                <w:szCs w:val="19"/>
-              </w:rPr>
-              <w:t xml:space="preserve">Diário, não compartilhado</w:t>
-            </w:r>
-          </w:p>
-        </w:tc>
-        <w:tc>
-          <w:tcPr>
-            <w:tcW w:type="dxa" w:w="2256"/>
-          </w:tcPr>
-          <w:p>
-            <w:r>
-              <w:rPr>
-                <w:b w:val="false"/>
-                <w:bCs w:val="false"/>
-                <w:color w:val="000000"/>
-                <w:sz w:val="19"/>
-                <w:szCs w:val="19"/>
-              </w:rPr>
-              <w:t xml:space="preserve">—</w:t>
-            </w:r>
-          </w:p>
-        </w:tc>
-        <w:tc>
-          <w:tcPr>
-            <w:tcW w:type="dxa" w:w="2256"/>
-          </w:tcPr>
-          <w:p>
-            <w:r>
-              <w:rPr>
-                <w:b w:val="false"/>
-                <w:bCs w:val="false"/>
-                <w:color w:val="000000"/>
-                <w:sz w:val="19"/>
-                <w:szCs w:val="19"/>
-              </w:rPr>
-              <w:t xml:space="preserve">—</w:t>
             </w:r>
           </w:p>
         </w:tc>
@@ -1437,7 +1367,7 @@
           <w:sz w:val="21"/>
           <w:szCs w:val="21"/>
         </w:rPr>
-        <w:t xml:space="preserve"> "Se você é dono de imobiliária ou administradora em Porto Alegre, Canoas, São Leopoldo ou Novo Hamburgo, eu tenho uma proposta para te fazer. Estamos adquirindo empresas e carteiras de aluguéis e condomínios na sua região. Se você está pensando em vender sua carteira ou sua empresa, você vai negociar diretamente comigo, fundador da Eleva."</w:t>
+        <w:t xml:space="preserve"> "Se você é dono de imobiliária ou administradora em Porto Alegre, Canoas, São Leopoldo ou Novo Hamburgo, eu tenho uma proposta para te fazer. Estamos adquirindo empresas e carteiras de aluguéis e condomínios na sua região. Se você está pensando em vender sua carteira ou sua empresa, você pode negociar diretamente comigo, o fundador da Eleva."</w:t>
       </w:r>
     </w:p>
     <w:p>

</xml_diff>